<commit_message>
ooxmlsdk-pdf: import bitmap effects and picture bullets
</commit_message>
<xml_diff>
--- a/test-data/ooxmlsdk-pdf-test/libreoffice/watermark.docx
+++ b/test-data/ooxmlsdk-pdf-test/libreoffice/watermark.docx
@@ -1,17 +1,8 @@
 
 <file path=word/document.xml><?xml version="1.0" encoding="utf-8"?>
-<w:document xmlns:wpc="http://schemas.microsoft.com/office/word/2010/wordprocessingCanvas" xmlns:cx="http://schemas.microsoft.com/office/drawing/2014/chartex" xmlns:cx1="http://schemas.microsoft.com/office/drawing/2015/9/8/chartex" xmlns:cx2="http://schemas.microsoft.com/office/drawing/2015/10/21/chartex" xmlns:cx3="http://schemas.microsoft.com/office/drawing/2016/5/9/chartex" xmlns:cx4="http://schemas.microsoft.com/office/drawing/2016/5/10/chartex" xmlns:cx5="http://schemas.microsoft.com/office/drawing/2016/5/11/chartex" xmlns:cx6="http://schemas.microsoft.com/office/drawing/2016/5/12/chartex" xmlns:cx7="http://schemas.microsoft.com/office/drawing/2016/5/13/chartex" xmlns:cx8="http://schemas.microsoft.com/office/drawing/2016/5/14/chartex" xmlns:mc="http://schemas.openxmlformats.org/markup-compatibility/2006" xmlns:o="urn:schemas-microsoft-com:office:office" xmlns:r="http://schemas.openxmlformats.org/officeDocument/2006/relationships" xmlns:m="http://schemas.openxmlformats.org/officeDocument/2006/math" xmlns:v="urn:schemas-microsoft-com:vml" xmlns:wp14="http://schemas.microsoft.com/office/word/2010/wordprocessingDrawing" xmlns:wp="http://schemas.openxmlformats.org/drawingml/2006/wordprocessingDrawing" xmlns:w10="urn:schemas-microsoft-com:office:word" xmlns:w="http://schemas.openxmlformats.org/wordprocessingml/2006/main" xmlns:w14="http://schemas.microsoft.com/office/word/2010/wordml" xmlns:w15="http://schemas.microsoft.com/office/word/2012/wordml" xmlns:w16se="http://schemas.microsoft.com/office/word/2015/wordml/symex" xmlns:wpg="http://schemas.microsoft.com/office/word/2010/wordprocessingGroup" xmlns:wpi="http://schemas.microsoft.com/office/word/2010/wordprocessingInk" xmlns:wne="http://schemas.microsoft.com/office/word/2006/wordml" xmlns:wps="http://schemas.microsoft.com/office/word/2010/wordprocessingShape" mc:Ignorable="w14 w15 w16se wp14">
+<w:document xmlns:wpc="http://schemas.microsoft.com/office/word/2010/wordprocessingCanvas" xmlns:cx="http://schemas.microsoft.com/office/drawing/2014/chartex" xmlns:cx1="http://schemas.microsoft.com/office/drawing/2015/9/8/chartex" xmlns:cx2="http://schemas.microsoft.com/office/drawing/2015/10/21/chartex" xmlns:cx3="http://schemas.microsoft.com/office/drawing/2016/5/9/chartex" xmlns:cx4="http://schemas.microsoft.com/office/drawing/2016/5/10/chartex" xmlns:cx5="http://schemas.microsoft.com/office/drawing/2016/5/11/chartex" xmlns:cx6="http://schemas.microsoft.com/office/drawing/2016/5/12/chartex" xmlns:cx7="http://schemas.microsoft.com/office/drawing/2016/5/13/chartex" xmlns:cx8="http://schemas.microsoft.com/office/drawing/2016/5/14/chartex" xmlns:mc="http://schemas.openxmlformats.org/markup-compatibility/2006" xmlns:aink="http://schemas.microsoft.com/office/drawing/2016/ink" xmlns:am3d="http://schemas.microsoft.com/office/drawing/2017/model3d" xmlns:o="urn:schemas-microsoft-com:office:office" xmlns:r="http://schemas.openxmlformats.org/officeDocument/2006/relationships" xmlns:m="http://schemas.openxmlformats.org/officeDocument/2006/math" xmlns:v="urn:schemas-microsoft-com:vml" xmlns:wp14="http://schemas.microsoft.com/office/word/2010/wordprocessingDrawing" xmlns:wp="http://schemas.openxmlformats.org/drawingml/2006/wordprocessingDrawing" xmlns:w10="urn:schemas-microsoft-com:office:word" xmlns:w="http://schemas.openxmlformats.org/wordprocessingml/2006/main" xmlns:w14="http://schemas.microsoft.com/office/word/2010/wordml" xmlns:w15="http://schemas.microsoft.com/office/word/2012/wordml" xmlns:w16cex="http://schemas.microsoft.com/office/word/2018/wordml/cex" xmlns:w16cid="http://schemas.microsoft.com/office/word/2016/wordml/cid" xmlns:w16="http://schemas.microsoft.com/office/word/2018/wordml" xmlns:w16sdtdh="http://schemas.microsoft.com/office/word/2020/wordml/sdtdatahash" xmlns:w16se="http://schemas.microsoft.com/office/word/2015/wordml/symex" xmlns:wpg="http://schemas.microsoft.com/office/word/2010/wordprocessingGroup" xmlns:wpi="http://schemas.microsoft.com/office/word/2010/wordprocessingInk" xmlns:wne="http://schemas.microsoft.com/office/word/2006/wordml" xmlns:wps="http://schemas.microsoft.com/office/word/2010/wordprocessingShape" mc:Ignorable="w14 w15 w16se w16cid w16 w16cex w16sdtdh wp14">
   <w:body>
-    <w:p>
-      <w:r>
-        <w:t xml:space="preserve">The document contains custom </w:t>
-      </w:r>
-      <w:bookmarkStart w:id="0" w:name="_GoBack"/>
-      <w:bookmarkEnd w:id="0"/>
-      <w:r>
-        <w:t>watermark.</w:t>
-      </w:r>
-    </w:p>
+    <w:p/>
     <w:sectPr>
       <w:headerReference w:type="even" r:id="rId6"/>
       <w:headerReference w:type="default" r:id="rId7"/>
@@ -19,9 +10,9 @@
       <w:footerReference w:type="default" r:id="rId9"/>
       <w:headerReference w:type="first" r:id="rId10"/>
       <w:footerReference w:type="first" r:id="rId11"/>
-      <w:pgSz w:w="11906" w:h="16838"/>
-      <w:pgMar w:top="1440" w:right="1440" w:bottom="1440" w:left="1440" w:header="708" w:footer="708" w:gutter="0"/>
-      <w:cols w:space="708"/>
+      <w:pgSz w:w="12240" w:h="15840"/>
+      <w:pgMar w:top="1440" w:right="1440" w:bottom="1440" w:left="1440" w:header="720" w:footer="720" w:gutter="0"/>
+      <w:cols w:space="720"/>
       <w:docGrid w:linePitch="360"/>
     </w:sectPr>
   </w:body>
@@ -29,7 +20,7 @@
 </file>
 
 <file path=word/endnotes.xml><?xml version="1.0" encoding="utf-8"?>
-<w:endnotes xmlns:wpc="http://schemas.microsoft.com/office/word/2010/wordprocessingCanvas" xmlns:cx="http://schemas.microsoft.com/office/drawing/2014/chartex" xmlns:cx1="http://schemas.microsoft.com/office/drawing/2015/9/8/chartex" xmlns:cx2="http://schemas.microsoft.com/office/drawing/2015/10/21/chartex" xmlns:cx3="http://schemas.microsoft.com/office/drawing/2016/5/9/chartex" xmlns:cx4="http://schemas.microsoft.com/office/drawing/2016/5/10/chartex" xmlns:cx5="http://schemas.microsoft.com/office/drawing/2016/5/11/chartex" xmlns:cx6="http://schemas.microsoft.com/office/drawing/2016/5/12/chartex" xmlns:cx7="http://schemas.microsoft.com/office/drawing/2016/5/13/chartex" xmlns:cx8="http://schemas.microsoft.com/office/drawing/2016/5/14/chartex" xmlns:mc="http://schemas.openxmlformats.org/markup-compatibility/2006" xmlns:o="urn:schemas-microsoft-com:office:office" xmlns:r="http://schemas.openxmlformats.org/officeDocument/2006/relationships" xmlns:m="http://schemas.openxmlformats.org/officeDocument/2006/math" xmlns:v="urn:schemas-microsoft-com:vml" xmlns:wp14="http://schemas.microsoft.com/office/word/2010/wordprocessingDrawing" xmlns:wp="http://schemas.openxmlformats.org/drawingml/2006/wordprocessingDrawing" xmlns:w10="urn:schemas-microsoft-com:office:word" xmlns:w="http://schemas.openxmlformats.org/wordprocessingml/2006/main" xmlns:w14="http://schemas.microsoft.com/office/word/2010/wordml" xmlns:w15="http://schemas.microsoft.com/office/word/2012/wordml" xmlns:w16se="http://schemas.microsoft.com/office/word/2015/wordml/symex" xmlns:wpg="http://schemas.microsoft.com/office/word/2010/wordprocessingGroup" xmlns:wpi="http://schemas.microsoft.com/office/word/2010/wordprocessingInk" xmlns:wne="http://schemas.microsoft.com/office/word/2006/wordml" xmlns:wps="http://schemas.microsoft.com/office/word/2010/wordprocessingShape" mc:Ignorable="w14 w15 w16se wp14">
+<w:endnotes xmlns:wpc="http://schemas.microsoft.com/office/word/2010/wordprocessingCanvas" xmlns:cx="http://schemas.microsoft.com/office/drawing/2014/chartex" xmlns:cx1="http://schemas.microsoft.com/office/drawing/2015/9/8/chartex" xmlns:cx2="http://schemas.microsoft.com/office/drawing/2015/10/21/chartex" xmlns:cx3="http://schemas.microsoft.com/office/drawing/2016/5/9/chartex" xmlns:cx4="http://schemas.microsoft.com/office/drawing/2016/5/10/chartex" xmlns:cx5="http://schemas.microsoft.com/office/drawing/2016/5/11/chartex" xmlns:cx6="http://schemas.microsoft.com/office/drawing/2016/5/12/chartex" xmlns:cx7="http://schemas.microsoft.com/office/drawing/2016/5/13/chartex" xmlns:cx8="http://schemas.microsoft.com/office/drawing/2016/5/14/chartex" xmlns:mc="http://schemas.openxmlformats.org/markup-compatibility/2006" xmlns:aink="http://schemas.microsoft.com/office/drawing/2016/ink" xmlns:am3d="http://schemas.microsoft.com/office/drawing/2017/model3d" xmlns:o="urn:schemas-microsoft-com:office:office" xmlns:r="http://schemas.openxmlformats.org/officeDocument/2006/relationships" xmlns:m="http://schemas.openxmlformats.org/officeDocument/2006/math" xmlns:v="urn:schemas-microsoft-com:vml" xmlns:wp14="http://schemas.microsoft.com/office/word/2010/wordprocessingDrawing" xmlns:wp="http://schemas.openxmlformats.org/drawingml/2006/wordprocessingDrawing" xmlns:w10="urn:schemas-microsoft-com:office:word" xmlns:w="http://schemas.openxmlformats.org/wordprocessingml/2006/main" xmlns:w14="http://schemas.microsoft.com/office/word/2010/wordml" xmlns:w15="http://schemas.microsoft.com/office/word/2012/wordml" xmlns:w16cex="http://schemas.microsoft.com/office/word/2018/wordml/cex" xmlns:w16cid="http://schemas.microsoft.com/office/word/2016/wordml/cid" xmlns:w16="http://schemas.microsoft.com/office/word/2018/wordml" xmlns:w16sdtdh="http://schemas.microsoft.com/office/word/2020/wordml/sdtdatahash" xmlns:w16se="http://schemas.microsoft.com/office/word/2015/wordml/symex" xmlns:wpg="http://schemas.microsoft.com/office/word/2010/wordprocessingGroup" xmlns:wpi="http://schemas.microsoft.com/office/word/2010/wordprocessingInk" xmlns:wne="http://schemas.microsoft.com/office/word/2006/wordml" xmlns:wps="http://schemas.microsoft.com/office/word/2010/wordprocessingShape" mc:Ignorable="w14 w15 w16se w16cid w16 w16cex w16sdtdh wp14">
   <w:endnote w:type="separator" w:id="-1">
     <w:p>
       <w:pPr>
@@ -54,7 +45,7 @@
 </file>
 
 <file path=word/footer1.xml><?xml version="1.0" encoding="utf-8"?>
-<w:ftr xmlns:wpc="http://schemas.microsoft.com/office/word/2010/wordprocessingCanvas" xmlns:cx="http://schemas.microsoft.com/office/drawing/2014/chartex" xmlns:cx1="http://schemas.microsoft.com/office/drawing/2015/9/8/chartex" xmlns:cx2="http://schemas.microsoft.com/office/drawing/2015/10/21/chartex" xmlns:cx3="http://schemas.microsoft.com/office/drawing/2016/5/9/chartex" xmlns:cx4="http://schemas.microsoft.com/office/drawing/2016/5/10/chartex" xmlns:cx5="http://schemas.microsoft.com/office/drawing/2016/5/11/chartex" xmlns:cx6="http://schemas.microsoft.com/office/drawing/2016/5/12/chartex" xmlns:cx7="http://schemas.microsoft.com/office/drawing/2016/5/13/chartex" xmlns:cx8="http://schemas.microsoft.com/office/drawing/2016/5/14/chartex" xmlns:mc="http://schemas.openxmlformats.org/markup-compatibility/2006" xmlns:o="urn:schemas-microsoft-com:office:office" xmlns:r="http://schemas.openxmlformats.org/officeDocument/2006/relationships" xmlns:m="http://schemas.openxmlformats.org/officeDocument/2006/math" xmlns:v="urn:schemas-microsoft-com:vml" xmlns:wp14="http://schemas.microsoft.com/office/word/2010/wordprocessingDrawing" xmlns:wp="http://schemas.openxmlformats.org/drawingml/2006/wordprocessingDrawing" xmlns:w10="urn:schemas-microsoft-com:office:word" xmlns:w="http://schemas.openxmlformats.org/wordprocessingml/2006/main" xmlns:w14="http://schemas.microsoft.com/office/word/2010/wordml" xmlns:w15="http://schemas.microsoft.com/office/word/2012/wordml" xmlns:w16se="http://schemas.microsoft.com/office/word/2015/wordml/symex" xmlns:wpg="http://schemas.microsoft.com/office/word/2010/wordprocessingGroup" xmlns:wpi="http://schemas.microsoft.com/office/word/2010/wordprocessingInk" xmlns:wne="http://schemas.microsoft.com/office/word/2006/wordml" xmlns:wps="http://schemas.microsoft.com/office/word/2010/wordprocessingShape" mc:Ignorable="w14 w15 w16se wp14">
+<w:ftr xmlns:wpc="http://schemas.microsoft.com/office/word/2010/wordprocessingCanvas" xmlns:cx="http://schemas.microsoft.com/office/drawing/2014/chartex" xmlns:cx1="http://schemas.microsoft.com/office/drawing/2015/9/8/chartex" xmlns:cx2="http://schemas.microsoft.com/office/drawing/2015/10/21/chartex" xmlns:cx3="http://schemas.microsoft.com/office/drawing/2016/5/9/chartex" xmlns:cx4="http://schemas.microsoft.com/office/drawing/2016/5/10/chartex" xmlns:cx5="http://schemas.microsoft.com/office/drawing/2016/5/11/chartex" xmlns:cx6="http://schemas.microsoft.com/office/drawing/2016/5/12/chartex" xmlns:cx7="http://schemas.microsoft.com/office/drawing/2016/5/13/chartex" xmlns:cx8="http://schemas.microsoft.com/office/drawing/2016/5/14/chartex" xmlns:mc="http://schemas.openxmlformats.org/markup-compatibility/2006" xmlns:aink="http://schemas.microsoft.com/office/drawing/2016/ink" xmlns:am3d="http://schemas.microsoft.com/office/drawing/2017/model3d" xmlns:o="urn:schemas-microsoft-com:office:office" xmlns:r="http://schemas.openxmlformats.org/officeDocument/2006/relationships" xmlns:m="http://schemas.openxmlformats.org/officeDocument/2006/math" xmlns:v="urn:schemas-microsoft-com:vml" xmlns:wp14="http://schemas.microsoft.com/office/word/2010/wordprocessingDrawing" xmlns:wp="http://schemas.openxmlformats.org/drawingml/2006/wordprocessingDrawing" xmlns:w10="urn:schemas-microsoft-com:office:word" xmlns:w="http://schemas.openxmlformats.org/wordprocessingml/2006/main" xmlns:w14="http://schemas.microsoft.com/office/word/2010/wordml" xmlns:w15="http://schemas.microsoft.com/office/word/2012/wordml" xmlns:w16cex="http://schemas.microsoft.com/office/word/2018/wordml/cex" xmlns:w16cid="http://schemas.microsoft.com/office/word/2016/wordml/cid" xmlns:w16="http://schemas.microsoft.com/office/word/2018/wordml" xmlns:w16sdtdh="http://schemas.microsoft.com/office/word/2020/wordml/sdtdatahash" xmlns:w16se="http://schemas.microsoft.com/office/word/2015/wordml/symex" xmlns:wpg="http://schemas.microsoft.com/office/word/2010/wordprocessingGroup" xmlns:wpi="http://schemas.microsoft.com/office/word/2010/wordprocessingInk" xmlns:wne="http://schemas.microsoft.com/office/word/2006/wordml" xmlns:wps="http://schemas.microsoft.com/office/word/2010/wordprocessingShape" mc:Ignorable="w14 w15 w16se w16cid w16 w16cex w16sdtdh wp14">
   <w:p>
     <w:pPr>
       <w:pStyle w:val="Footer"/>
@@ -64,7 +55,7 @@
 </file>
 
 <file path=word/footer2.xml><?xml version="1.0" encoding="utf-8"?>
-<w:ftr xmlns:wpc="http://schemas.microsoft.com/office/word/2010/wordprocessingCanvas" xmlns:cx="http://schemas.microsoft.com/office/drawing/2014/chartex" xmlns:cx1="http://schemas.microsoft.com/office/drawing/2015/9/8/chartex" xmlns:cx2="http://schemas.microsoft.com/office/drawing/2015/10/21/chartex" xmlns:cx3="http://schemas.microsoft.com/office/drawing/2016/5/9/chartex" xmlns:cx4="http://schemas.microsoft.com/office/drawing/2016/5/10/chartex" xmlns:cx5="http://schemas.microsoft.com/office/drawing/2016/5/11/chartex" xmlns:cx6="http://schemas.microsoft.com/office/drawing/2016/5/12/chartex" xmlns:cx7="http://schemas.microsoft.com/office/drawing/2016/5/13/chartex" xmlns:cx8="http://schemas.microsoft.com/office/drawing/2016/5/14/chartex" xmlns:mc="http://schemas.openxmlformats.org/markup-compatibility/2006" xmlns:o="urn:schemas-microsoft-com:office:office" xmlns:r="http://schemas.openxmlformats.org/officeDocument/2006/relationships" xmlns:m="http://schemas.openxmlformats.org/officeDocument/2006/math" xmlns:v="urn:schemas-microsoft-com:vml" xmlns:wp14="http://schemas.microsoft.com/office/word/2010/wordprocessingDrawing" xmlns:wp="http://schemas.openxmlformats.org/drawingml/2006/wordprocessingDrawing" xmlns:w10="urn:schemas-microsoft-com:office:word" xmlns:w="http://schemas.openxmlformats.org/wordprocessingml/2006/main" xmlns:w14="http://schemas.microsoft.com/office/word/2010/wordml" xmlns:w15="http://schemas.microsoft.com/office/word/2012/wordml" xmlns:w16se="http://schemas.microsoft.com/office/word/2015/wordml/symex" xmlns:wpg="http://schemas.microsoft.com/office/word/2010/wordprocessingGroup" xmlns:wpi="http://schemas.microsoft.com/office/word/2010/wordprocessingInk" xmlns:wne="http://schemas.microsoft.com/office/word/2006/wordml" xmlns:wps="http://schemas.microsoft.com/office/word/2010/wordprocessingShape" mc:Ignorable="w14 w15 w16se wp14">
+<w:ftr xmlns:wpc="http://schemas.microsoft.com/office/word/2010/wordprocessingCanvas" xmlns:cx="http://schemas.microsoft.com/office/drawing/2014/chartex" xmlns:cx1="http://schemas.microsoft.com/office/drawing/2015/9/8/chartex" xmlns:cx2="http://schemas.microsoft.com/office/drawing/2015/10/21/chartex" xmlns:cx3="http://schemas.microsoft.com/office/drawing/2016/5/9/chartex" xmlns:cx4="http://schemas.microsoft.com/office/drawing/2016/5/10/chartex" xmlns:cx5="http://schemas.microsoft.com/office/drawing/2016/5/11/chartex" xmlns:cx6="http://schemas.microsoft.com/office/drawing/2016/5/12/chartex" xmlns:cx7="http://schemas.microsoft.com/office/drawing/2016/5/13/chartex" xmlns:cx8="http://schemas.microsoft.com/office/drawing/2016/5/14/chartex" xmlns:mc="http://schemas.openxmlformats.org/markup-compatibility/2006" xmlns:aink="http://schemas.microsoft.com/office/drawing/2016/ink" xmlns:am3d="http://schemas.microsoft.com/office/drawing/2017/model3d" xmlns:o="urn:schemas-microsoft-com:office:office" xmlns:r="http://schemas.openxmlformats.org/officeDocument/2006/relationships" xmlns:m="http://schemas.openxmlformats.org/officeDocument/2006/math" xmlns:v="urn:schemas-microsoft-com:vml" xmlns:wp14="http://schemas.microsoft.com/office/word/2010/wordprocessingDrawing" xmlns:wp="http://schemas.openxmlformats.org/drawingml/2006/wordprocessingDrawing" xmlns:w10="urn:schemas-microsoft-com:office:word" xmlns:w="http://schemas.openxmlformats.org/wordprocessingml/2006/main" xmlns:w14="http://schemas.microsoft.com/office/word/2010/wordml" xmlns:w15="http://schemas.microsoft.com/office/word/2012/wordml" xmlns:w16cex="http://schemas.microsoft.com/office/word/2018/wordml/cex" xmlns:w16cid="http://schemas.microsoft.com/office/word/2016/wordml/cid" xmlns:w16="http://schemas.microsoft.com/office/word/2018/wordml" xmlns:w16sdtdh="http://schemas.microsoft.com/office/word/2020/wordml/sdtdatahash" xmlns:w16se="http://schemas.microsoft.com/office/word/2015/wordml/symex" xmlns:wpg="http://schemas.microsoft.com/office/word/2010/wordprocessingGroup" xmlns:wpi="http://schemas.microsoft.com/office/word/2010/wordprocessingInk" xmlns:wne="http://schemas.microsoft.com/office/word/2006/wordml" xmlns:wps="http://schemas.microsoft.com/office/word/2010/wordprocessingShape" mc:Ignorable="w14 w15 w16se w16cid w16 w16cex w16sdtdh wp14">
   <w:p>
     <w:pPr>
       <w:pStyle w:val="Footer"/>
@@ -74,7 +65,7 @@
 </file>
 
 <file path=word/footer3.xml><?xml version="1.0" encoding="utf-8"?>
-<w:ftr xmlns:wpc="http://schemas.microsoft.com/office/word/2010/wordprocessingCanvas" xmlns:cx="http://schemas.microsoft.com/office/drawing/2014/chartex" xmlns:cx1="http://schemas.microsoft.com/office/drawing/2015/9/8/chartex" xmlns:cx2="http://schemas.microsoft.com/office/drawing/2015/10/21/chartex" xmlns:cx3="http://schemas.microsoft.com/office/drawing/2016/5/9/chartex" xmlns:cx4="http://schemas.microsoft.com/office/drawing/2016/5/10/chartex" xmlns:cx5="http://schemas.microsoft.com/office/drawing/2016/5/11/chartex" xmlns:cx6="http://schemas.microsoft.com/office/drawing/2016/5/12/chartex" xmlns:cx7="http://schemas.microsoft.com/office/drawing/2016/5/13/chartex" xmlns:cx8="http://schemas.microsoft.com/office/drawing/2016/5/14/chartex" xmlns:mc="http://schemas.openxmlformats.org/markup-compatibility/2006" xmlns:o="urn:schemas-microsoft-com:office:office" xmlns:r="http://schemas.openxmlformats.org/officeDocument/2006/relationships" xmlns:m="http://schemas.openxmlformats.org/officeDocument/2006/math" xmlns:v="urn:schemas-microsoft-com:vml" xmlns:wp14="http://schemas.microsoft.com/office/word/2010/wordprocessingDrawing" xmlns:wp="http://schemas.openxmlformats.org/drawingml/2006/wordprocessingDrawing" xmlns:w10="urn:schemas-microsoft-com:office:word" xmlns:w="http://schemas.openxmlformats.org/wordprocessingml/2006/main" xmlns:w14="http://schemas.microsoft.com/office/word/2010/wordml" xmlns:w15="http://schemas.microsoft.com/office/word/2012/wordml" xmlns:w16se="http://schemas.microsoft.com/office/word/2015/wordml/symex" xmlns:wpg="http://schemas.microsoft.com/office/word/2010/wordprocessingGroup" xmlns:wpi="http://schemas.microsoft.com/office/word/2010/wordprocessingInk" xmlns:wne="http://schemas.microsoft.com/office/word/2006/wordml" xmlns:wps="http://schemas.microsoft.com/office/word/2010/wordprocessingShape" mc:Ignorable="w14 w15 w16se wp14">
+<w:ftr xmlns:wpc="http://schemas.microsoft.com/office/word/2010/wordprocessingCanvas" xmlns:cx="http://schemas.microsoft.com/office/drawing/2014/chartex" xmlns:cx1="http://schemas.microsoft.com/office/drawing/2015/9/8/chartex" xmlns:cx2="http://schemas.microsoft.com/office/drawing/2015/10/21/chartex" xmlns:cx3="http://schemas.microsoft.com/office/drawing/2016/5/9/chartex" xmlns:cx4="http://schemas.microsoft.com/office/drawing/2016/5/10/chartex" xmlns:cx5="http://schemas.microsoft.com/office/drawing/2016/5/11/chartex" xmlns:cx6="http://schemas.microsoft.com/office/drawing/2016/5/12/chartex" xmlns:cx7="http://schemas.microsoft.com/office/drawing/2016/5/13/chartex" xmlns:cx8="http://schemas.microsoft.com/office/drawing/2016/5/14/chartex" xmlns:mc="http://schemas.openxmlformats.org/markup-compatibility/2006" xmlns:aink="http://schemas.microsoft.com/office/drawing/2016/ink" xmlns:am3d="http://schemas.microsoft.com/office/drawing/2017/model3d" xmlns:o="urn:schemas-microsoft-com:office:office" xmlns:r="http://schemas.openxmlformats.org/officeDocument/2006/relationships" xmlns:m="http://schemas.openxmlformats.org/officeDocument/2006/math" xmlns:v="urn:schemas-microsoft-com:vml" xmlns:wp14="http://schemas.microsoft.com/office/word/2010/wordprocessingDrawing" xmlns:wp="http://schemas.openxmlformats.org/drawingml/2006/wordprocessingDrawing" xmlns:w10="urn:schemas-microsoft-com:office:word" xmlns:w="http://schemas.openxmlformats.org/wordprocessingml/2006/main" xmlns:w14="http://schemas.microsoft.com/office/word/2010/wordml" xmlns:w15="http://schemas.microsoft.com/office/word/2012/wordml" xmlns:w16cex="http://schemas.microsoft.com/office/word/2018/wordml/cex" xmlns:w16cid="http://schemas.microsoft.com/office/word/2016/wordml/cid" xmlns:w16="http://schemas.microsoft.com/office/word/2018/wordml" xmlns:w16sdtdh="http://schemas.microsoft.com/office/word/2020/wordml/sdtdatahash" xmlns:w16se="http://schemas.microsoft.com/office/word/2015/wordml/symex" xmlns:wpg="http://schemas.microsoft.com/office/word/2010/wordprocessingGroup" xmlns:wpi="http://schemas.microsoft.com/office/word/2010/wordprocessingInk" xmlns:wne="http://schemas.microsoft.com/office/word/2006/wordml" xmlns:wps="http://schemas.microsoft.com/office/word/2010/wordprocessingShape" mc:Ignorable="w14 w15 w16se w16cid w16 w16cex w16sdtdh wp14">
   <w:p>
     <w:pPr>
       <w:pStyle w:val="Footer"/>
@@ -84,7 +75,7 @@
 </file>
 
 <file path=word/footnotes.xml><?xml version="1.0" encoding="utf-8"?>
-<w:footnotes xmlns:wpc="http://schemas.microsoft.com/office/word/2010/wordprocessingCanvas" xmlns:cx="http://schemas.microsoft.com/office/drawing/2014/chartex" xmlns:cx1="http://schemas.microsoft.com/office/drawing/2015/9/8/chartex" xmlns:cx2="http://schemas.microsoft.com/office/drawing/2015/10/21/chartex" xmlns:cx3="http://schemas.microsoft.com/office/drawing/2016/5/9/chartex" xmlns:cx4="http://schemas.microsoft.com/office/drawing/2016/5/10/chartex" xmlns:cx5="http://schemas.microsoft.com/office/drawing/2016/5/11/chartex" xmlns:cx6="http://schemas.microsoft.com/office/drawing/2016/5/12/chartex" xmlns:cx7="http://schemas.microsoft.com/office/drawing/2016/5/13/chartex" xmlns:cx8="http://schemas.microsoft.com/office/drawing/2016/5/14/chartex" xmlns:mc="http://schemas.openxmlformats.org/markup-compatibility/2006" xmlns:o="urn:schemas-microsoft-com:office:office" xmlns:r="http://schemas.openxmlformats.org/officeDocument/2006/relationships" xmlns:m="http://schemas.openxmlformats.org/officeDocument/2006/math" xmlns:v="urn:schemas-microsoft-com:vml" xmlns:wp14="http://schemas.microsoft.com/office/word/2010/wordprocessingDrawing" xmlns:wp="http://schemas.openxmlformats.org/drawingml/2006/wordprocessingDrawing" xmlns:w10="urn:schemas-microsoft-com:office:word" xmlns:w="http://schemas.openxmlformats.org/wordprocessingml/2006/main" xmlns:w14="http://schemas.microsoft.com/office/word/2010/wordml" xmlns:w15="http://schemas.microsoft.com/office/word/2012/wordml" xmlns:w16se="http://schemas.microsoft.com/office/word/2015/wordml/symex" xmlns:wpg="http://schemas.microsoft.com/office/word/2010/wordprocessingGroup" xmlns:wpi="http://schemas.microsoft.com/office/word/2010/wordprocessingInk" xmlns:wne="http://schemas.microsoft.com/office/word/2006/wordml" xmlns:wps="http://schemas.microsoft.com/office/word/2010/wordprocessingShape" mc:Ignorable="w14 w15 w16se wp14">
+<w:footnotes xmlns:wpc="http://schemas.microsoft.com/office/word/2010/wordprocessingCanvas" xmlns:cx="http://schemas.microsoft.com/office/drawing/2014/chartex" xmlns:cx1="http://schemas.microsoft.com/office/drawing/2015/9/8/chartex" xmlns:cx2="http://schemas.microsoft.com/office/drawing/2015/10/21/chartex" xmlns:cx3="http://schemas.microsoft.com/office/drawing/2016/5/9/chartex" xmlns:cx4="http://schemas.microsoft.com/office/drawing/2016/5/10/chartex" xmlns:cx5="http://schemas.microsoft.com/office/drawing/2016/5/11/chartex" xmlns:cx6="http://schemas.microsoft.com/office/drawing/2016/5/12/chartex" xmlns:cx7="http://schemas.microsoft.com/office/drawing/2016/5/13/chartex" xmlns:cx8="http://schemas.microsoft.com/office/drawing/2016/5/14/chartex" xmlns:mc="http://schemas.openxmlformats.org/markup-compatibility/2006" xmlns:aink="http://schemas.microsoft.com/office/drawing/2016/ink" xmlns:am3d="http://schemas.microsoft.com/office/drawing/2017/model3d" xmlns:o="urn:schemas-microsoft-com:office:office" xmlns:r="http://schemas.openxmlformats.org/officeDocument/2006/relationships" xmlns:m="http://schemas.openxmlformats.org/officeDocument/2006/math" xmlns:v="urn:schemas-microsoft-com:vml" xmlns:wp14="http://schemas.microsoft.com/office/word/2010/wordprocessingDrawing" xmlns:wp="http://schemas.openxmlformats.org/drawingml/2006/wordprocessingDrawing" xmlns:w10="urn:schemas-microsoft-com:office:word" xmlns:w="http://schemas.openxmlformats.org/wordprocessingml/2006/main" xmlns:w14="http://schemas.microsoft.com/office/word/2010/wordml" xmlns:w15="http://schemas.microsoft.com/office/word/2012/wordml" xmlns:w16cex="http://schemas.microsoft.com/office/word/2018/wordml/cex" xmlns:w16cid="http://schemas.microsoft.com/office/word/2016/wordml/cid" xmlns:w16="http://schemas.microsoft.com/office/word/2018/wordml" xmlns:w16sdtdh="http://schemas.microsoft.com/office/word/2020/wordml/sdtdatahash" xmlns:w16se="http://schemas.microsoft.com/office/word/2015/wordml/symex" xmlns:wpg="http://schemas.microsoft.com/office/word/2010/wordprocessingGroup" xmlns:wpi="http://schemas.microsoft.com/office/word/2010/wordprocessingInk" xmlns:wne="http://schemas.microsoft.com/office/word/2006/wordml" xmlns:wps="http://schemas.microsoft.com/office/word/2010/wordprocessingShape" mc:Ignorable="w14 w15 w16se w16cid w16 w16cex w16sdtdh wp14">
   <w:footnote w:type="separator" w:id="-1">
     <w:p>
       <w:pPr>
@@ -109,7 +100,7 @@
 </file>
 
 <file path=word/header1.xml><?xml version="1.0" encoding="utf-8"?>
-<w:hdr xmlns:wpc="http://schemas.microsoft.com/office/word/2010/wordprocessingCanvas" xmlns:cx="http://schemas.microsoft.com/office/drawing/2014/chartex" xmlns:cx1="http://schemas.microsoft.com/office/drawing/2015/9/8/chartex" xmlns:cx2="http://schemas.microsoft.com/office/drawing/2015/10/21/chartex" xmlns:cx3="http://schemas.microsoft.com/office/drawing/2016/5/9/chartex" xmlns:cx4="http://schemas.microsoft.com/office/drawing/2016/5/10/chartex" xmlns:cx5="http://schemas.microsoft.com/office/drawing/2016/5/11/chartex" xmlns:cx6="http://schemas.microsoft.com/office/drawing/2016/5/12/chartex" xmlns:cx7="http://schemas.microsoft.com/office/drawing/2016/5/13/chartex" xmlns:cx8="http://schemas.microsoft.com/office/drawing/2016/5/14/chartex" xmlns:mc="http://schemas.openxmlformats.org/markup-compatibility/2006" xmlns:o="urn:schemas-microsoft-com:office:office" xmlns:r="http://schemas.openxmlformats.org/officeDocument/2006/relationships" xmlns:m="http://schemas.openxmlformats.org/officeDocument/2006/math" xmlns:v="urn:schemas-microsoft-com:vml" xmlns:wp14="http://schemas.microsoft.com/office/word/2010/wordprocessingDrawing" xmlns:wp="http://schemas.openxmlformats.org/drawingml/2006/wordprocessingDrawing" xmlns:w10="urn:schemas-microsoft-com:office:word" xmlns:w="http://schemas.openxmlformats.org/wordprocessingml/2006/main" xmlns:w14="http://schemas.microsoft.com/office/word/2010/wordml" xmlns:w15="http://schemas.microsoft.com/office/word/2012/wordml" xmlns:w16se="http://schemas.microsoft.com/office/word/2015/wordml/symex" xmlns:wpg="http://schemas.microsoft.com/office/word/2010/wordprocessingGroup" xmlns:wpi="http://schemas.microsoft.com/office/word/2010/wordprocessingInk" xmlns:wne="http://schemas.microsoft.com/office/word/2006/wordml" xmlns:wps="http://schemas.microsoft.com/office/word/2010/wordprocessingShape" mc:Ignorable="w14 w15 w16se wp14">
+<w:hdr xmlns:wpc="http://schemas.microsoft.com/office/word/2010/wordprocessingCanvas" xmlns:cx="http://schemas.microsoft.com/office/drawing/2014/chartex" xmlns:cx1="http://schemas.microsoft.com/office/drawing/2015/9/8/chartex" xmlns:cx2="http://schemas.microsoft.com/office/drawing/2015/10/21/chartex" xmlns:cx3="http://schemas.microsoft.com/office/drawing/2016/5/9/chartex" xmlns:cx4="http://schemas.microsoft.com/office/drawing/2016/5/10/chartex" xmlns:cx5="http://schemas.microsoft.com/office/drawing/2016/5/11/chartex" xmlns:cx6="http://schemas.microsoft.com/office/drawing/2016/5/12/chartex" xmlns:cx7="http://schemas.microsoft.com/office/drawing/2016/5/13/chartex" xmlns:cx8="http://schemas.microsoft.com/office/drawing/2016/5/14/chartex" xmlns:mc="http://schemas.openxmlformats.org/markup-compatibility/2006" xmlns:aink="http://schemas.microsoft.com/office/drawing/2016/ink" xmlns:am3d="http://schemas.microsoft.com/office/drawing/2017/model3d" xmlns:o="urn:schemas-microsoft-com:office:office" xmlns:r="http://schemas.openxmlformats.org/officeDocument/2006/relationships" xmlns:m="http://schemas.openxmlformats.org/officeDocument/2006/math" xmlns:v="urn:schemas-microsoft-com:vml" xmlns:wp14="http://schemas.microsoft.com/office/word/2010/wordprocessingDrawing" xmlns:wp="http://schemas.openxmlformats.org/drawingml/2006/wordprocessingDrawing" xmlns:w10="urn:schemas-microsoft-com:office:word" xmlns:w="http://schemas.openxmlformats.org/wordprocessingml/2006/main" xmlns:w14="http://schemas.microsoft.com/office/word/2010/wordml" xmlns:w15="http://schemas.microsoft.com/office/word/2012/wordml" xmlns:w16cex="http://schemas.microsoft.com/office/word/2018/wordml/cex" xmlns:w16cid="http://schemas.microsoft.com/office/word/2016/wordml/cid" xmlns:w16="http://schemas.microsoft.com/office/word/2018/wordml" xmlns:w16sdtdh="http://schemas.microsoft.com/office/word/2020/wordml/sdtdatahash" xmlns:w16se="http://schemas.microsoft.com/office/word/2015/wordml/symex" xmlns:wpg="http://schemas.microsoft.com/office/word/2010/wordprocessingGroup" xmlns:wpi="http://schemas.microsoft.com/office/word/2010/wordprocessingInk" xmlns:wne="http://schemas.microsoft.com/office/word/2006/wordml" xmlns:wps="http://schemas.microsoft.com/office/word/2010/wordprocessingShape" mc:Ignorable="w14 w15 w16se w16cid w16 w16cex w16sdtdh wp14">
   <w:p>
     <w:pPr>
       <w:pStyle w:val="Header"/>
@@ -118,34 +109,28 @@
       <w:rPr>
         <w:noProof/>
       </w:rPr>
-      <w:pict>
-        <v:shapetype id="_x0000_t136" coordsize="21600,21600" o:spt="136" adj="10800" path="m@7,l@8,m@5,21600l@6,21600e">
+      <w:pict w14:anchorId="3D316ACC">
+        <v:shapetype id="_x0000_t75" coordsize="21600,21600" o:spt="75" o:preferrelative="t" path="m@4@5l@4@11@9@11@9@5xe" filled="f" stroked="f">
+          <v:stroke joinstyle="miter"/>
           <v:formulas>
-            <v:f eqn="sum #0 0 10800"/>
-            <v:f eqn="prod #0 2 1"/>
-            <v:f eqn="sum 21600 0 @1"/>
-            <v:f eqn="sum 0 0 @2"/>
-            <v:f eqn="sum 21600 0 @3"/>
-            <v:f eqn="if @0 @3 0"/>
-            <v:f eqn="if @0 21600 @1"/>
-            <v:f eqn="if @0 0 @2"/>
-            <v:f eqn="if @0 @4 21600"/>
-            <v:f eqn="mid @5 @6"/>
-            <v:f eqn="mid @8 @5"/>
-            <v:f eqn="mid @7 @8"/>
-            <v:f eqn="mid @6 @7"/>
-            <v:f eqn="sum @6 0 @5"/>
+            <v:f eqn="if lineDrawn pixelLineWidth 0"/>
+            <v:f eqn="sum @0 1 0"/>
+            <v:f eqn="sum 0 0 @1"/>
+            <v:f eqn="prod @2 1 2"/>
+            <v:f eqn="prod @3 21600 pixelWidth"/>
+            <v:f eqn="prod @3 21600 pixelHeight"/>
+            <v:f eqn="sum @0 0 1"/>
+            <v:f eqn="prod @6 1 2"/>
+            <v:f eqn="prod @7 21600 pixelWidth"/>
+            <v:f eqn="sum @8 21600 0"/>
+            <v:f eqn="prod @7 21600 pixelHeight"/>
+            <v:f eqn="sum @10 21600 0"/>
           </v:formulas>
-          <v:path textpathok="t" o:connecttype="custom" o:connectlocs="@9,0;@10,10800;@11,21600;@12,10800" o:connectangles="270,180,90,0"/>
-          <v:textpath on="t" fitshape="t"/>
-          <v:handles>
-            <v:h position="#0,bottomRight" xrange="6629,14971"/>
-          </v:handles>
-          <o:lock v:ext="edit" text="t" shapetype="t"/>
+          <v:path o:extrusionok="f" gradientshapeok="t" o:connecttype="rect"/>
+          <o:lock v:ext="edit" aspectratio="t"/>
         </v:shapetype>
-        <v:shape id="PowerPlusWaterMarkObject909344" o:spid="_x0000_s2050" type="#_x0000_t136" style="position:absolute;margin-left:0;margin-top:0;width:599.9pt;height:36.35pt;rotation:315;z-index:-251655168;mso-position-horizontal:center;mso-position-horizontal-relative:margin;mso-position-vertical:center;mso-position-vertical-relative:margin" o:allowincell="f" fillcolor="#548dd4 [1951]" stroked="f">
-          <v:fill opacity=".5"/>
-          <v:textpath style="font-family:&quot;DejaVu Sans Light&quot;;font-size:1pt" string="CustomWatermark"/>
+        <v:shape id="WordPictureWatermark52679422" o:spid="_x0000_s2050" type="#_x0000_t75" style="position:absolute;margin-left:0;margin-top:0;width:467.95pt;height:467.95pt;z-index:-251657216;mso-position-horizontal:center;mso-position-horizontal-relative:margin;mso-position-vertical:center;mso-position-vertical-relative:margin" o:allowincell="f">
+          <v:imagedata r:id="rId1" o:title="libreoffice" gain="19661f" blacklevel="22938f"/>
         </v:shape>
       </w:pict>
     </w:r>
@@ -154,7 +139,7 @@
 </file>
 
 <file path=word/header2.xml><?xml version="1.0" encoding="utf-8"?>
-<w:hdr xmlns:wpc="http://schemas.microsoft.com/office/word/2010/wordprocessingCanvas" xmlns:cx="http://schemas.microsoft.com/office/drawing/2014/chartex" xmlns:cx1="http://schemas.microsoft.com/office/drawing/2015/9/8/chartex" xmlns:cx2="http://schemas.microsoft.com/office/drawing/2015/10/21/chartex" xmlns:cx3="http://schemas.microsoft.com/office/drawing/2016/5/9/chartex" xmlns:cx4="http://schemas.microsoft.com/office/drawing/2016/5/10/chartex" xmlns:cx5="http://schemas.microsoft.com/office/drawing/2016/5/11/chartex" xmlns:cx6="http://schemas.microsoft.com/office/drawing/2016/5/12/chartex" xmlns:cx7="http://schemas.microsoft.com/office/drawing/2016/5/13/chartex" xmlns:cx8="http://schemas.microsoft.com/office/drawing/2016/5/14/chartex" xmlns:mc="http://schemas.openxmlformats.org/markup-compatibility/2006" xmlns:o="urn:schemas-microsoft-com:office:office" xmlns:r="http://schemas.openxmlformats.org/officeDocument/2006/relationships" xmlns:m="http://schemas.openxmlformats.org/officeDocument/2006/math" xmlns:v="urn:schemas-microsoft-com:vml" xmlns:wp14="http://schemas.microsoft.com/office/word/2010/wordprocessingDrawing" xmlns:wp="http://schemas.openxmlformats.org/drawingml/2006/wordprocessingDrawing" xmlns:w10="urn:schemas-microsoft-com:office:word" xmlns:w="http://schemas.openxmlformats.org/wordprocessingml/2006/main" xmlns:w14="http://schemas.microsoft.com/office/word/2010/wordml" xmlns:w15="http://schemas.microsoft.com/office/word/2012/wordml" xmlns:w16se="http://schemas.microsoft.com/office/word/2015/wordml/symex" xmlns:wpg="http://schemas.microsoft.com/office/word/2010/wordprocessingGroup" xmlns:wpi="http://schemas.microsoft.com/office/word/2010/wordprocessingInk" xmlns:wne="http://schemas.microsoft.com/office/word/2006/wordml" xmlns:wps="http://schemas.microsoft.com/office/word/2010/wordprocessingShape" mc:Ignorable="w14 w15 w16se wp14">
+<w:hdr xmlns:wpc="http://schemas.microsoft.com/office/word/2010/wordprocessingCanvas" xmlns:cx="http://schemas.microsoft.com/office/drawing/2014/chartex" xmlns:cx1="http://schemas.microsoft.com/office/drawing/2015/9/8/chartex" xmlns:cx2="http://schemas.microsoft.com/office/drawing/2015/10/21/chartex" xmlns:cx3="http://schemas.microsoft.com/office/drawing/2016/5/9/chartex" xmlns:cx4="http://schemas.microsoft.com/office/drawing/2016/5/10/chartex" xmlns:cx5="http://schemas.microsoft.com/office/drawing/2016/5/11/chartex" xmlns:cx6="http://schemas.microsoft.com/office/drawing/2016/5/12/chartex" xmlns:cx7="http://schemas.microsoft.com/office/drawing/2016/5/13/chartex" xmlns:cx8="http://schemas.microsoft.com/office/drawing/2016/5/14/chartex" xmlns:mc="http://schemas.openxmlformats.org/markup-compatibility/2006" xmlns:aink="http://schemas.microsoft.com/office/drawing/2016/ink" xmlns:am3d="http://schemas.microsoft.com/office/drawing/2017/model3d" xmlns:o="urn:schemas-microsoft-com:office:office" xmlns:r="http://schemas.openxmlformats.org/officeDocument/2006/relationships" xmlns:m="http://schemas.openxmlformats.org/officeDocument/2006/math" xmlns:v="urn:schemas-microsoft-com:vml" xmlns:wp14="http://schemas.microsoft.com/office/word/2010/wordprocessingDrawing" xmlns:wp="http://schemas.openxmlformats.org/drawingml/2006/wordprocessingDrawing" xmlns:w10="urn:schemas-microsoft-com:office:word" xmlns:w="http://schemas.openxmlformats.org/wordprocessingml/2006/main" xmlns:w14="http://schemas.microsoft.com/office/word/2010/wordml" xmlns:w15="http://schemas.microsoft.com/office/word/2012/wordml" xmlns:w16cex="http://schemas.microsoft.com/office/word/2018/wordml/cex" xmlns:w16cid="http://schemas.microsoft.com/office/word/2016/wordml/cid" xmlns:w16="http://schemas.microsoft.com/office/word/2018/wordml" xmlns:w16sdtdh="http://schemas.microsoft.com/office/word/2020/wordml/sdtdatahash" xmlns:w16se="http://schemas.microsoft.com/office/word/2015/wordml/symex" xmlns:wpg="http://schemas.microsoft.com/office/word/2010/wordprocessingGroup" xmlns:wpi="http://schemas.microsoft.com/office/word/2010/wordprocessingInk" xmlns:wne="http://schemas.microsoft.com/office/word/2006/wordml" xmlns:wps="http://schemas.microsoft.com/office/word/2010/wordprocessingShape" mc:Ignorable="w14 w15 w16se w16cid w16 w16cex w16sdtdh wp14">
   <w:p>
     <w:pPr>
       <w:pStyle w:val="Header"/>
@@ -163,34 +148,28 @@
       <w:rPr>
         <w:noProof/>
       </w:rPr>
-      <w:pict>
-        <v:shapetype id="_x0000_t136" coordsize="21600,21600" o:spt="136" adj="10800" path="m@7,l@8,m@5,21600l@6,21600e">
+      <w:pict w14:anchorId="058EBB7E">
+        <v:shapetype id="_x0000_t75" coordsize="21600,21600" o:spt="75" o:preferrelative="t" path="m@4@5l@4@11@9@11@9@5xe" filled="f" stroked="f">
+          <v:stroke joinstyle="miter"/>
           <v:formulas>
-            <v:f eqn="sum #0 0 10800"/>
-            <v:f eqn="prod #0 2 1"/>
-            <v:f eqn="sum 21600 0 @1"/>
-            <v:f eqn="sum 0 0 @2"/>
-            <v:f eqn="sum 21600 0 @3"/>
-            <v:f eqn="if @0 @3 0"/>
-            <v:f eqn="if @0 21600 @1"/>
-            <v:f eqn="if @0 0 @2"/>
-            <v:f eqn="if @0 @4 21600"/>
-            <v:f eqn="mid @5 @6"/>
-            <v:f eqn="mid @8 @5"/>
-            <v:f eqn="mid @7 @8"/>
-            <v:f eqn="mid @6 @7"/>
-            <v:f eqn="sum @6 0 @5"/>
+            <v:f eqn="if lineDrawn pixelLineWidth 0"/>
+            <v:f eqn="sum @0 1 0"/>
+            <v:f eqn="sum 0 0 @1"/>
+            <v:f eqn="prod @2 1 2"/>
+            <v:f eqn="prod @3 21600 pixelWidth"/>
+            <v:f eqn="prod @3 21600 pixelHeight"/>
+            <v:f eqn="sum @0 0 1"/>
+            <v:f eqn="prod @6 1 2"/>
+            <v:f eqn="prod @7 21600 pixelWidth"/>
+            <v:f eqn="sum @8 21600 0"/>
+            <v:f eqn="prod @7 21600 pixelHeight"/>
+            <v:f eqn="sum @10 21600 0"/>
           </v:formulas>
-          <v:path textpathok="t" o:connecttype="custom" o:connectlocs="@9,0;@10,10800;@11,21600;@12,10800" o:connectangles="270,180,90,0"/>
-          <v:textpath on="t" fitshape="t"/>
-          <v:handles>
-            <v:h position="#0,bottomRight" xrange="6629,14971"/>
-          </v:handles>
-          <o:lock v:ext="edit" text="t" shapetype="t"/>
+          <v:path o:extrusionok="f" gradientshapeok="t" o:connecttype="rect"/>
+          <o:lock v:ext="edit" aspectratio="t"/>
         </v:shapetype>
-        <v:shape id="PowerPlusWaterMarkObject909345" o:spid="_x0000_s2051" type="#_x0000_t136" style="position:absolute;margin-left:0;margin-top:0;width:599.9pt;height:36.35pt;rotation:315;z-index:-251653120;mso-position-horizontal:center;mso-position-horizontal-relative:margin;mso-position-vertical:center;mso-position-vertical-relative:margin" o:allowincell="f" fillcolor="#548dd4 [1951]" stroked="f">
-          <v:fill opacity=".5"/>
-          <v:textpath style="font-family:&quot;DejaVu Sans Light&quot;;font-size:1pt" string="CustomWatermark"/>
+        <v:shape id="WordPictureWatermark52679423" o:spid="_x0000_s2051" type="#_x0000_t75" style="position:absolute;margin-left:0;margin-top:0;width:467.95pt;height:467.95pt;z-index:-251656192;mso-position-horizontal:center;mso-position-horizontal-relative:margin;mso-position-vertical:center;mso-position-vertical-relative:margin" o:allowincell="f">
+          <v:imagedata r:id="rId1" o:title="libreoffice" gain="19661f" blacklevel="22938f"/>
         </v:shape>
       </w:pict>
     </w:r>
@@ -199,7 +178,7 @@
 </file>
 
 <file path=word/header3.xml><?xml version="1.0" encoding="utf-8"?>
-<w:hdr xmlns:wpc="http://schemas.microsoft.com/office/word/2010/wordprocessingCanvas" xmlns:cx="http://schemas.microsoft.com/office/drawing/2014/chartex" xmlns:cx1="http://schemas.microsoft.com/office/drawing/2015/9/8/chartex" xmlns:cx2="http://schemas.microsoft.com/office/drawing/2015/10/21/chartex" xmlns:cx3="http://schemas.microsoft.com/office/drawing/2016/5/9/chartex" xmlns:cx4="http://schemas.microsoft.com/office/drawing/2016/5/10/chartex" xmlns:cx5="http://schemas.microsoft.com/office/drawing/2016/5/11/chartex" xmlns:cx6="http://schemas.microsoft.com/office/drawing/2016/5/12/chartex" xmlns:cx7="http://schemas.microsoft.com/office/drawing/2016/5/13/chartex" xmlns:cx8="http://schemas.microsoft.com/office/drawing/2016/5/14/chartex" xmlns:mc="http://schemas.openxmlformats.org/markup-compatibility/2006" xmlns:o="urn:schemas-microsoft-com:office:office" xmlns:r="http://schemas.openxmlformats.org/officeDocument/2006/relationships" xmlns:m="http://schemas.openxmlformats.org/officeDocument/2006/math" xmlns:v="urn:schemas-microsoft-com:vml" xmlns:wp14="http://schemas.microsoft.com/office/word/2010/wordprocessingDrawing" xmlns:wp="http://schemas.openxmlformats.org/drawingml/2006/wordprocessingDrawing" xmlns:w10="urn:schemas-microsoft-com:office:word" xmlns:w="http://schemas.openxmlformats.org/wordprocessingml/2006/main" xmlns:w14="http://schemas.microsoft.com/office/word/2010/wordml" xmlns:w15="http://schemas.microsoft.com/office/word/2012/wordml" xmlns:w16se="http://schemas.microsoft.com/office/word/2015/wordml/symex" xmlns:wpg="http://schemas.microsoft.com/office/word/2010/wordprocessingGroup" xmlns:wpi="http://schemas.microsoft.com/office/word/2010/wordprocessingInk" xmlns:wne="http://schemas.microsoft.com/office/word/2006/wordml" xmlns:wps="http://schemas.microsoft.com/office/word/2010/wordprocessingShape" mc:Ignorable="w14 w15 w16se wp14">
+<w:hdr xmlns:wpc="http://schemas.microsoft.com/office/word/2010/wordprocessingCanvas" xmlns:cx="http://schemas.microsoft.com/office/drawing/2014/chartex" xmlns:cx1="http://schemas.microsoft.com/office/drawing/2015/9/8/chartex" xmlns:cx2="http://schemas.microsoft.com/office/drawing/2015/10/21/chartex" xmlns:cx3="http://schemas.microsoft.com/office/drawing/2016/5/9/chartex" xmlns:cx4="http://schemas.microsoft.com/office/drawing/2016/5/10/chartex" xmlns:cx5="http://schemas.microsoft.com/office/drawing/2016/5/11/chartex" xmlns:cx6="http://schemas.microsoft.com/office/drawing/2016/5/12/chartex" xmlns:cx7="http://schemas.microsoft.com/office/drawing/2016/5/13/chartex" xmlns:cx8="http://schemas.microsoft.com/office/drawing/2016/5/14/chartex" xmlns:mc="http://schemas.openxmlformats.org/markup-compatibility/2006" xmlns:aink="http://schemas.microsoft.com/office/drawing/2016/ink" xmlns:am3d="http://schemas.microsoft.com/office/drawing/2017/model3d" xmlns:o="urn:schemas-microsoft-com:office:office" xmlns:r="http://schemas.openxmlformats.org/officeDocument/2006/relationships" xmlns:m="http://schemas.openxmlformats.org/officeDocument/2006/math" xmlns:v="urn:schemas-microsoft-com:vml" xmlns:wp14="http://schemas.microsoft.com/office/word/2010/wordprocessingDrawing" xmlns:wp="http://schemas.openxmlformats.org/drawingml/2006/wordprocessingDrawing" xmlns:w10="urn:schemas-microsoft-com:office:word" xmlns:w="http://schemas.openxmlformats.org/wordprocessingml/2006/main" xmlns:w14="http://schemas.microsoft.com/office/word/2010/wordml" xmlns:w15="http://schemas.microsoft.com/office/word/2012/wordml" xmlns:w16cex="http://schemas.microsoft.com/office/word/2018/wordml/cex" xmlns:w16cid="http://schemas.microsoft.com/office/word/2016/wordml/cid" xmlns:w16="http://schemas.microsoft.com/office/word/2018/wordml" xmlns:w16sdtdh="http://schemas.microsoft.com/office/word/2020/wordml/sdtdatahash" xmlns:w16se="http://schemas.microsoft.com/office/word/2015/wordml/symex" xmlns:wpg="http://schemas.microsoft.com/office/word/2010/wordprocessingGroup" xmlns:wpi="http://schemas.microsoft.com/office/word/2010/wordprocessingInk" xmlns:wne="http://schemas.microsoft.com/office/word/2006/wordml" xmlns:wps="http://schemas.microsoft.com/office/word/2010/wordprocessingShape" mc:Ignorable="w14 w15 w16se w16cid w16 w16cex w16sdtdh wp14">
   <w:p>
     <w:pPr>
       <w:pStyle w:val="Header"/>
@@ -208,34 +187,28 @@
       <w:rPr>
         <w:noProof/>
       </w:rPr>
-      <w:pict>
-        <v:shapetype id="_x0000_t136" coordsize="21600,21600" o:spt="136" adj="10800" path="m@7,l@8,m@5,21600l@6,21600e">
+      <w:pict w14:anchorId="3D72E20A">
+        <v:shapetype id="_x0000_t75" coordsize="21600,21600" o:spt="75" o:preferrelative="t" path="m@4@5l@4@11@9@11@9@5xe" filled="f" stroked="f">
+          <v:stroke joinstyle="miter"/>
           <v:formulas>
-            <v:f eqn="sum #0 0 10800"/>
-            <v:f eqn="prod #0 2 1"/>
-            <v:f eqn="sum 21600 0 @1"/>
-            <v:f eqn="sum 0 0 @2"/>
-            <v:f eqn="sum 21600 0 @3"/>
-            <v:f eqn="if @0 @3 0"/>
-            <v:f eqn="if @0 21600 @1"/>
-            <v:f eqn="if @0 0 @2"/>
-            <v:f eqn="if @0 @4 21600"/>
-            <v:f eqn="mid @5 @6"/>
-            <v:f eqn="mid @8 @5"/>
-            <v:f eqn="mid @7 @8"/>
-            <v:f eqn="mid @6 @7"/>
-            <v:f eqn="sum @6 0 @5"/>
+            <v:f eqn="if lineDrawn pixelLineWidth 0"/>
+            <v:f eqn="sum @0 1 0"/>
+            <v:f eqn="sum 0 0 @1"/>
+            <v:f eqn="prod @2 1 2"/>
+            <v:f eqn="prod @3 21600 pixelWidth"/>
+            <v:f eqn="prod @3 21600 pixelHeight"/>
+            <v:f eqn="sum @0 0 1"/>
+            <v:f eqn="prod @6 1 2"/>
+            <v:f eqn="prod @7 21600 pixelWidth"/>
+            <v:f eqn="sum @8 21600 0"/>
+            <v:f eqn="prod @7 21600 pixelHeight"/>
+            <v:f eqn="sum @10 21600 0"/>
           </v:formulas>
-          <v:path textpathok="t" o:connecttype="custom" o:connectlocs="@9,0;@10,10800;@11,21600;@12,10800" o:connectangles="270,180,90,0"/>
-          <v:textpath on="t" fitshape="t"/>
-          <v:handles>
-            <v:h position="#0,bottomRight" xrange="6629,14971"/>
-          </v:handles>
-          <o:lock v:ext="edit" text="t" shapetype="t"/>
+          <v:path o:extrusionok="f" gradientshapeok="t" o:connecttype="rect"/>
+          <o:lock v:ext="edit" aspectratio="t"/>
         </v:shapetype>
-        <v:shape id="PowerPlusWaterMarkObject909343" o:spid="_x0000_s2049" type="#_x0000_t136" style="position:absolute;margin-left:0;margin-top:0;width:599.9pt;height:36.35pt;rotation:315;z-index:-251657216;mso-position-horizontal:center;mso-position-horizontal-relative:margin;mso-position-vertical:center;mso-position-vertical-relative:margin" o:allowincell="f" fillcolor="#548dd4 [1951]" stroked="f">
-          <v:fill opacity=".5"/>
-          <v:textpath style="font-family:&quot;DejaVu Sans Light&quot;;font-size:1pt" string="CustomWatermark"/>
+        <v:shape id="WordPictureWatermark52679421" o:spid="_x0000_s2049" type="#_x0000_t75" style="position:absolute;margin-left:0;margin-top:0;width:467.95pt;height:467.95pt;z-index:-251658240;mso-position-horizontal:center;mso-position-horizontal-relative:margin;mso-position-vertical:center;mso-position-vertical-relative:margin" o:allowincell="f">
+          <v:imagedata r:id="rId1" o:title="libreoffice" gain="19661f" blacklevel="22938f"/>
         </v:shape>
       </w:pict>
     </w:r>
@@ -244,23 +217,23 @@
 </file>
 
 <file path=word/styles.xml><?xml version="1.0" encoding="utf-8"?>
-<w:styles xmlns:mc="http://schemas.openxmlformats.org/markup-compatibility/2006" xmlns:r="http://schemas.openxmlformats.org/officeDocument/2006/relationships" xmlns:w="http://schemas.openxmlformats.org/wordprocessingml/2006/main" xmlns:w14="http://schemas.microsoft.com/office/word/2010/wordml" xmlns:w15="http://schemas.microsoft.com/office/word/2012/wordml" xmlns:w16se="http://schemas.microsoft.com/office/word/2015/wordml/symex" mc:Ignorable="w14 w15 w16se">
+<w:styles xmlns:mc="http://schemas.openxmlformats.org/markup-compatibility/2006" xmlns:r="http://schemas.openxmlformats.org/officeDocument/2006/relationships" xmlns:w="http://schemas.openxmlformats.org/wordprocessingml/2006/main" xmlns:w14="http://schemas.microsoft.com/office/word/2010/wordml" xmlns:w15="http://schemas.microsoft.com/office/word/2012/wordml" xmlns:w16cex="http://schemas.microsoft.com/office/word/2018/wordml/cex" xmlns:w16cid="http://schemas.microsoft.com/office/word/2016/wordml/cid" xmlns:w16="http://schemas.microsoft.com/office/word/2018/wordml" xmlns:w16sdtdh="http://schemas.microsoft.com/office/word/2020/wordml/sdtdatahash" xmlns:w16se="http://schemas.microsoft.com/office/word/2015/wordml/symex" mc:Ignorable="w14 w15 w16se w16cid w16 w16cex w16sdtdh">
   <w:docDefaults>
     <w:rPrDefault>
       <w:rPr>
         <w:rFonts w:asciiTheme="minorHAnsi" w:eastAsiaTheme="minorHAnsi" w:hAnsiTheme="minorHAnsi" w:cstheme="minorBidi"/>
         <w:sz w:val="22"/>
         <w:szCs w:val="22"/>
-        <w:lang w:val="en-GB" w:eastAsia="en-US" w:bidi="ar-SA"/>
+        <w:lang w:val="en-US" w:eastAsia="en-US" w:bidi="ar-SA"/>
       </w:rPr>
     </w:rPrDefault>
     <w:pPrDefault>
       <w:pPr>
-        <w:spacing w:after="200" w:line="276" w:lineRule="auto"/>
+        <w:spacing w:after="160" w:line="259" w:lineRule="auto"/>
       </w:pPr>
     </w:pPrDefault>
   </w:docDefaults>
-  <w:latentStyles w:defLockedState="0" w:defUIPriority="99" w:defSemiHidden="0" w:defUnhideWhenUsed="0" w:defQFormat="0" w:count="374">
+  <w:latentStyles w:defLockedState="0" w:defUIPriority="99" w:defSemiHidden="0" w:defUnhideWhenUsed="0" w:defQFormat="0" w:count="376">
     <w:lsdException w:name="Normal" w:uiPriority="0" w:qFormat="1"/>
     <w:lsdException w:name="heading 1" w:uiPriority="9" w:qFormat="1"/>
     <w:lsdException w:name="heading 2" w:semiHidden="1" w:uiPriority="9" w:unhideWhenUsed="1" w:qFormat="1"/>
@@ -366,7 +339,6 @@
     <w:lsdException w:name="HTML Sample" w:semiHidden="1" w:unhideWhenUsed="1"/>
     <w:lsdException w:name="HTML Typewriter" w:semiHidden="1" w:unhideWhenUsed="1"/>
     <w:lsdException w:name="HTML Variable" w:semiHidden="1" w:unhideWhenUsed="1"/>
-    <w:lsdException w:name="Normal Table" w:semiHidden="1" w:unhideWhenUsed="1"/>
     <w:lsdException w:name="annotation subject" w:semiHidden="1" w:unhideWhenUsed="1"/>
     <w:lsdException w:name="No List" w:semiHidden="1" w:unhideWhenUsed="1"/>
     <w:lsdException w:name="Outline List 1" w:semiHidden="1" w:unhideWhenUsed="1"/>
@@ -413,10 +385,8 @@
     <w:lsdException w:name="Table Subtle 2" w:semiHidden="1" w:unhideWhenUsed="1"/>
     <w:lsdException w:name="Table Web 1" w:semiHidden="1" w:unhideWhenUsed="1"/>
     <w:lsdException w:name="Table Web 2" w:semiHidden="1" w:unhideWhenUsed="1"/>
-    <w:lsdException w:name="Table Web 3" w:semiHidden="1" w:unhideWhenUsed="1"/>
     <w:lsdException w:name="Balloon Text" w:semiHidden="1" w:unhideWhenUsed="1"/>
-    <w:lsdException w:name="Table Grid" w:uiPriority="59"/>
-    <w:lsdException w:name="Table Theme" w:semiHidden="1" w:unhideWhenUsed="1"/>
+    <w:lsdException w:name="Table Grid" w:uiPriority="39"/>
     <w:lsdException w:name="Placeholder Text" w:semiHidden="1"/>
     <w:lsdException w:name="No Spacing" w:uiPriority="1" w:qFormat="1"/>
     <w:lsdException w:name="Light Shading" w:uiPriority="60"/>
@@ -635,6 +605,8 @@
     <w:lsdException w:name="Mention" w:semiHidden="1" w:unhideWhenUsed="1"/>
     <w:lsdException w:name="Smart Hyperlink" w:semiHidden="1" w:unhideWhenUsed="1"/>
     <w:lsdException w:name="Hashtag" w:semiHidden="1" w:unhideWhenUsed="1"/>
+    <w:lsdException w:name="Unresolved Mention" w:semiHidden="1" w:unhideWhenUsed="1"/>
+    <w:lsdException w:name="Smart Link" w:semiHidden="1" w:unhideWhenUsed="1"/>
   </w:latentStyles>
   <w:style w:type="paragraph" w:default="1" w:styleId="Normal">
     <w:name w:val="Normal"/>
@@ -673,7 +645,7 @@
     <w:link w:val="HeaderChar"/>
     <w:uiPriority w:val="99"/>
     <w:unhideWhenUsed/>
-    <w:rsid w:val="00C753A5"/>
+    <w:rsid w:val="00C51C1F"/>
     <w:pPr>
       <w:tabs>
         <w:tab w:val="center" w:pos="4680"/>
@@ -687,7 +659,7 @@
     <w:basedOn w:val="DefaultParagraphFont"/>
     <w:link w:val="Header"/>
     <w:uiPriority w:val="99"/>
-    <w:rsid w:val="00C753A5"/>
+    <w:rsid w:val="00C51C1F"/>
   </w:style>
   <w:style w:type="paragraph" w:styleId="Footer">
     <w:name w:val="footer"/>
@@ -695,7 +667,7 @@
     <w:link w:val="FooterChar"/>
     <w:uiPriority w:val="99"/>
     <w:unhideWhenUsed/>
-    <w:rsid w:val="00C753A5"/>
+    <w:rsid w:val="00C51C1F"/>
     <w:pPr>
       <w:tabs>
         <w:tab w:val="center" w:pos="4680"/>
@@ -709,7 +681,7 @@
     <w:basedOn w:val="DefaultParagraphFont"/>
     <w:link w:val="Footer"/>
     <w:uiPriority w:val="99"/>
-    <w:rsid w:val="00C753A5"/>
+    <w:rsid w:val="00C51C1F"/>
   </w:style>
 </w:styles>
 </file>
@@ -725,44 +697,44 @@
         <a:sysClr val="window" lastClr="FFFFFF"/>
       </a:lt1>
       <a:dk2>
-        <a:srgbClr val="1F497D"/>
+        <a:srgbClr val="44546A"/>
       </a:dk2>
       <a:lt2>
-        <a:srgbClr val="EEECE1"/>
+        <a:srgbClr val="E7E6E6"/>
       </a:lt2>
       <a:accent1>
-        <a:srgbClr val="4F81BD"/>
+        <a:srgbClr val="4472C4"/>
       </a:accent1>
       <a:accent2>
-        <a:srgbClr val="C0504D"/>
+        <a:srgbClr val="ED7D31"/>
       </a:accent2>
       <a:accent3>
-        <a:srgbClr val="9BBB59"/>
+        <a:srgbClr val="A5A5A5"/>
       </a:accent3>
       <a:accent4>
-        <a:srgbClr val="8064A2"/>
+        <a:srgbClr val="FFC000"/>
       </a:accent4>
       <a:accent5>
-        <a:srgbClr val="4BACC6"/>
+        <a:srgbClr val="5B9BD5"/>
       </a:accent5>
       <a:accent6>
-        <a:srgbClr val="F79646"/>
+        <a:srgbClr val="70AD47"/>
       </a:accent6>
       <a:hlink>
-        <a:srgbClr val="0000FF"/>
+        <a:srgbClr val="0563C1"/>
       </a:hlink>
       <a:folHlink>
-        <a:srgbClr val="800080"/>
+        <a:srgbClr val="954F72"/>
       </a:folHlink>
     </a:clrScheme>
     <a:fontScheme name="Office">
       <a:majorFont>
-        <a:latin typeface="Cambria"/>
+        <a:latin typeface="Calibri Light" panose="020F0302020204030204"/>
         <a:ea typeface=""/>
         <a:cs typeface=""/>
-        <a:font script="Jpan" typeface="ＭＳ ゴシック"/>
+        <a:font script="Jpan" typeface="游ゴシック Light"/>
         <a:font script="Hang" typeface="맑은 고딕"/>
-        <a:font script="Hans" typeface="宋体"/>
+        <a:font script="Hans" typeface="等线 Light"/>
         <a:font script="Hant" typeface="新細明體"/>
         <a:font script="Arab" typeface="Times New Roman"/>
         <a:font script="Hebr" typeface="Times New Roman"/>
@@ -790,14 +762,31 @@
         <a:font script="Viet" typeface="Times New Roman"/>
         <a:font script="Uigh" typeface="Microsoft Uighur"/>
         <a:font script="Geor" typeface="Sylfaen"/>
+        <a:font script="Armn" typeface="Arial"/>
+        <a:font script="Bugi" typeface="Leelawadee UI"/>
+        <a:font script="Bopo" typeface="Microsoft JhengHei"/>
+        <a:font script="Java" typeface="Javanese Text"/>
+        <a:font script="Lisu" typeface="Segoe UI"/>
+        <a:font script="Mymr" typeface="Myanmar Text"/>
+        <a:font script="Nkoo" typeface="Ebrima"/>
+        <a:font script="Olck" typeface="Nirmala UI"/>
+        <a:font script="Osma" typeface="Ebrima"/>
+        <a:font script="Phag" typeface="Phagspa"/>
+        <a:font script="Syrn" typeface="Estrangelo Edessa"/>
+        <a:font script="Syrj" typeface="Estrangelo Edessa"/>
+        <a:font script="Syre" typeface="Estrangelo Edessa"/>
+        <a:font script="Sora" typeface="Nirmala UI"/>
+        <a:font script="Tale" typeface="Microsoft Tai Le"/>
+        <a:font script="Talu" typeface="Microsoft New Tai Lue"/>
+        <a:font script="Tfng" typeface="Ebrima"/>
       </a:majorFont>
       <a:minorFont>
-        <a:latin typeface="Calibri"/>
+        <a:latin typeface="Calibri" panose="020F0502020204030204"/>
         <a:ea typeface=""/>
         <a:cs typeface=""/>
-        <a:font script="Jpan" typeface="ＭＳ 明朝"/>
+        <a:font script="Jpan" typeface="游明朝"/>
         <a:font script="Hang" typeface="맑은 고딕"/>
-        <a:font script="Hans" typeface="宋体"/>
+        <a:font script="Hans" typeface="等线"/>
         <a:font script="Hant" typeface="新細明體"/>
         <a:font script="Arab" typeface="Arial"/>
         <a:font script="Hebr" typeface="Arial"/>
@@ -825,6 +814,23 @@
         <a:font script="Viet" typeface="Arial"/>
         <a:font script="Uigh" typeface="Microsoft Uighur"/>
         <a:font script="Geor" typeface="Sylfaen"/>
+        <a:font script="Armn" typeface="Arial"/>
+        <a:font script="Bugi" typeface="Leelawadee UI"/>
+        <a:font script="Bopo" typeface="Microsoft JhengHei"/>
+        <a:font script="Java" typeface="Javanese Text"/>
+        <a:font script="Lisu" typeface="Segoe UI"/>
+        <a:font script="Mymr" typeface="Myanmar Text"/>
+        <a:font script="Nkoo" typeface="Ebrima"/>
+        <a:font script="Olck" typeface="Nirmala UI"/>
+        <a:font script="Osma" typeface="Ebrima"/>
+        <a:font script="Phag" typeface="Phagspa"/>
+        <a:font script="Syrn" typeface="Estrangelo Edessa"/>
+        <a:font script="Syrj" typeface="Estrangelo Edessa"/>
+        <a:font script="Syre" typeface="Estrangelo Edessa"/>
+        <a:font script="Sora" typeface="Nirmala UI"/>
+        <a:font script="Tale" typeface="Microsoft Tai Le"/>
+        <a:font script="Talu" typeface="Microsoft New Tai Lue"/>
+        <a:font script="Tfng" typeface="Ebrima"/>
       </a:minorFont>
     </a:fontScheme>
     <a:fmtScheme name="Office">
@@ -836,165 +842,141 @@
           <a:gsLst>
             <a:gs pos="0">
               <a:schemeClr val="phClr">
-                <a:tint val="50000"/>
-                <a:satMod val="300000"/>
+                <a:lumMod val="110000"/>
+                <a:satMod val="105000"/>
+                <a:tint val="67000"/>
               </a:schemeClr>
             </a:gs>
-            <a:gs pos="35000">
+            <a:gs pos="50000">
               <a:schemeClr val="phClr">
-                <a:tint val="37000"/>
-                <a:satMod val="300000"/>
+                <a:lumMod val="105000"/>
+                <a:satMod val="103000"/>
+                <a:tint val="73000"/>
               </a:schemeClr>
             </a:gs>
             <a:gs pos="100000">
               <a:schemeClr val="phClr">
-                <a:tint val="15000"/>
-                <a:satMod val="350000"/>
+                <a:lumMod val="105000"/>
+                <a:satMod val="109000"/>
+                <a:tint val="81000"/>
               </a:schemeClr>
             </a:gs>
           </a:gsLst>
-          <a:lin ang="16200000" scaled="1"/>
+          <a:lin ang="5400000" scaled="0"/>
         </a:gradFill>
         <a:gradFill rotWithShape="1">
           <a:gsLst>
             <a:gs pos="0">
               <a:schemeClr val="phClr">
-                <a:shade val="51000"/>
-                <a:satMod val="130000"/>
+                <a:satMod val="103000"/>
+                <a:lumMod val="102000"/>
+                <a:tint val="94000"/>
               </a:schemeClr>
             </a:gs>
-            <a:gs pos="80000">
+            <a:gs pos="50000">
               <a:schemeClr val="phClr">
-                <a:shade val="93000"/>
-                <a:satMod val="130000"/>
+                <a:satMod val="110000"/>
+                <a:lumMod val="100000"/>
+                <a:shade val="100000"/>
               </a:schemeClr>
             </a:gs>
             <a:gs pos="100000">
               <a:schemeClr val="phClr">
-                <a:shade val="94000"/>
-                <a:satMod val="135000"/>
+                <a:lumMod val="99000"/>
+                <a:satMod val="120000"/>
+                <a:shade val="78000"/>
               </a:schemeClr>
             </a:gs>
           </a:gsLst>
-          <a:lin ang="16200000" scaled="0"/>
+          <a:lin ang="5400000" scaled="0"/>
         </a:gradFill>
       </a:fillStyleLst>
       <a:lnStyleLst>
-        <a:ln w="9525" cap="flat" cmpd="sng" algn="ctr">
-          <a:solidFill>
-            <a:schemeClr val="phClr">
-              <a:shade val="95000"/>
-              <a:satMod val="105000"/>
-            </a:schemeClr>
-          </a:solidFill>
-          <a:prstDash val="solid"/>
-        </a:ln>
-        <a:ln w="25400" cap="flat" cmpd="sng" algn="ctr">
+        <a:ln w="6350" cap="flat" cmpd="sng" algn="ctr">
           <a:solidFill>
             <a:schemeClr val="phClr"/>
           </a:solidFill>
           <a:prstDash val="solid"/>
+          <a:miter lim="800000"/>
         </a:ln>
-        <a:ln w="38100" cap="flat" cmpd="sng" algn="ctr">
+        <a:ln w="12700" cap="flat" cmpd="sng" algn="ctr">
           <a:solidFill>
             <a:schemeClr val="phClr"/>
           </a:solidFill>
           <a:prstDash val="solid"/>
+          <a:miter lim="800000"/>
+        </a:ln>
+        <a:ln w="19050" cap="flat" cmpd="sng" algn="ctr">
+          <a:solidFill>
+            <a:schemeClr val="phClr"/>
+          </a:solidFill>
+          <a:prstDash val="solid"/>
+          <a:miter lim="800000"/>
         </a:ln>
       </a:lnStyleLst>
       <a:effectStyleLst>
         <a:effectStyle>
+          <a:effectLst/>
+        </a:effectStyle>
+        <a:effectStyle>
+          <a:effectLst/>
+        </a:effectStyle>
+        <a:effectStyle>
           <a:effectLst>
-            <a:outerShdw blurRad="40000" dist="20000" dir="5400000" rotWithShape="0">
+            <a:outerShdw blurRad="57150" dist="19050" dir="5400000" algn="ctr" rotWithShape="0">
               <a:srgbClr val="000000">
-                <a:alpha val="38000"/>
+                <a:alpha val="63000"/>
               </a:srgbClr>
             </a:outerShdw>
           </a:effectLst>
-        </a:effectStyle>
-        <a:effectStyle>
-          <a:effectLst>
-            <a:outerShdw blurRad="40000" dist="23000" dir="5400000" rotWithShape="0">
-              <a:srgbClr val="000000">
-                <a:alpha val="35000"/>
-              </a:srgbClr>
-            </a:outerShdw>
-          </a:effectLst>
-        </a:effectStyle>
-        <a:effectStyle>
-          <a:effectLst>
-            <a:outerShdw blurRad="40000" dist="23000" dir="5400000" rotWithShape="0">
-              <a:srgbClr val="000000">
-                <a:alpha val="35000"/>
-              </a:srgbClr>
-            </a:outerShdw>
-          </a:effectLst>
-          <a:scene3d>
-            <a:camera prst="orthographicFront">
-              <a:rot lat="0" lon="0" rev="0"/>
-            </a:camera>
-            <a:lightRig rig="threePt" dir="t">
-              <a:rot lat="0" lon="0" rev="1200000"/>
-            </a:lightRig>
-          </a:scene3d>
-          <a:sp3d>
-            <a:bevelT w="63500" h="25400"/>
-          </a:sp3d>
         </a:effectStyle>
       </a:effectStyleLst>
       <a:bgFillStyleLst>
         <a:solidFill>
           <a:schemeClr val="phClr"/>
         </a:solidFill>
+        <a:solidFill>
+          <a:schemeClr val="phClr">
+            <a:tint val="95000"/>
+            <a:satMod val="170000"/>
+          </a:schemeClr>
+        </a:solidFill>
         <a:gradFill rotWithShape="1">
           <a:gsLst>
             <a:gs pos="0">
               <a:schemeClr val="phClr">
-                <a:tint val="40000"/>
-                <a:satMod val="350000"/>
+                <a:tint val="93000"/>
+                <a:satMod val="150000"/>
+                <a:shade val="98000"/>
+                <a:lumMod val="102000"/>
               </a:schemeClr>
             </a:gs>
-            <a:gs pos="40000">
+            <a:gs pos="50000">
               <a:schemeClr val="phClr">
-                <a:tint val="45000"/>
-                <a:shade val="99000"/>
-                <a:satMod val="350000"/>
+                <a:tint val="98000"/>
+                <a:satMod val="130000"/>
+                <a:shade val="90000"/>
+                <a:lumMod val="103000"/>
               </a:schemeClr>
             </a:gs>
             <a:gs pos="100000">
               <a:schemeClr val="phClr">
-                <a:shade val="20000"/>
-                <a:satMod val="255000"/>
+                <a:shade val="63000"/>
+                <a:satMod val="120000"/>
               </a:schemeClr>
             </a:gs>
           </a:gsLst>
-          <a:path path="circle">
-            <a:fillToRect l="50000" t="-80000" r="50000" b="180000"/>
-          </a:path>
-        </a:gradFill>
-        <a:gradFill rotWithShape="1">
-          <a:gsLst>
-            <a:gs pos="0">
-              <a:schemeClr val="phClr">
-                <a:tint val="80000"/>
-                <a:satMod val="300000"/>
-              </a:schemeClr>
-            </a:gs>
-            <a:gs pos="100000">
-              <a:schemeClr val="phClr">
-                <a:shade val="30000"/>
-                <a:satMod val="200000"/>
-              </a:schemeClr>
-            </a:gs>
-          </a:gsLst>
-          <a:path path="circle">
-            <a:fillToRect l="50000" t="50000" r="50000" b="50000"/>
-          </a:path>
+          <a:lin ang="5400000" scaled="0"/>
         </a:gradFill>
       </a:bgFillStyleLst>
     </a:fmtScheme>
   </a:themeElements>
   <a:objectDefaults/>
   <a:extraClrSchemeLst/>
+  <a:extLst>
+    <a:ext uri="{05A4C25C-085E-4340-85A3-A5531E510DB2}">
+      <thm15:themeFamily xmlns:thm15="http://schemas.microsoft.com/office/thememl/2012/main" name="Office Theme" id="{62F939B6-93AF-4DB8-9C6B-D6C7DFDC589F}" vid="{4A3C46E8-61CC-4603-A589-7422A47A8E4A}"/>
+    </a:ext>
+  </a:extLst>
 </a:theme>
 </file>
</xml_diff>